<commit_message>
Investigacion de git con enlaces
</commit_message>
<xml_diff>
--- a/Qué es Git.docx
+++ b/Qué es Git.docx
@@ -144,6 +144,7 @@
           <w:lang w:val="es-419"/>
         </w:rPr>
       </w:pPr>
+      <w:proofErr w:type="spellStart"/>
       <w:r>
         <w:rPr>
           <w:b/>
@@ -152,6 +153,7 @@
         </w:rPr>
         <w:t>Commit</w:t>
       </w:r>
+      <w:proofErr w:type="spellEnd"/>
       <w:r>
         <w:rPr>
           <w:lang w:val="es-419"/>
@@ -194,6 +196,7 @@
           <w:lang w:val="es-419"/>
         </w:rPr>
       </w:pPr>
+      <w:proofErr w:type="spellStart"/>
       <w:r>
         <w:rPr>
           <w:b/>
@@ -202,6 +205,7 @@
         </w:rPr>
         <w:t>Merge</w:t>
       </w:r>
+      <w:proofErr w:type="spellEnd"/>
       <w:r>
         <w:rPr>
           <w:lang w:val="es-419"/>
@@ -273,8 +277,30 @@
         <w:rPr>
           <w:lang w:val="es-419"/>
         </w:rPr>
-        <w:t>: git init</w:t>
-      </w:r>
+        <w:t xml:space="preserve">: </w:t>
+      </w:r>
+      <w:proofErr w:type="spellStart"/>
+      <w:r>
+        <w:rPr>
+          <w:lang w:val="es-419"/>
+        </w:rPr>
+        <w:t>git</w:t>
+      </w:r>
+      <w:proofErr w:type="spellEnd"/>
+      <w:r>
+        <w:rPr>
+          <w:lang w:val="es-419"/>
+        </w:rPr>
+        <w:t xml:space="preserve"> </w:t>
+      </w:r>
+      <w:proofErr w:type="spellStart"/>
+      <w:r>
+        <w:rPr>
+          <w:lang w:val="es-419"/>
+        </w:rPr>
+        <w:t>init</w:t>
+      </w:r>
+      <w:proofErr w:type="spellEnd"/>
     </w:p>
     <w:p>
       <w:pPr>
@@ -286,13 +312,41 @@
           <w:lang w:val="en-US"/>
         </w:rPr>
       </w:pPr>
+      <w:proofErr w:type="spellStart"/>
       <w:r>
         <w:rPr>
           <w:b/>
           <w:bCs/>
           <w:lang w:val="en-US"/>
         </w:rPr>
-        <w:t>Agregar archivos al staging</w:t>
+        <w:t>Agregar</w:t>
+      </w:r>
+      <w:proofErr w:type="spellEnd"/>
+      <w:r>
+        <w:rPr>
+          <w:b/>
+          <w:bCs/>
+          <w:lang w:val="en-US"/>
+        </w:rPr>
+        <w:t xml:space="preserve"> </w:t>
+      </w:r>
+      <w:proofErr w:type="spellStart"/>
+      <w:r>
+        <w:rPr>
+          <w:b/>
+          <w:bCs/>
+          <w:lang w:val="en-US"/>
+        </w:rPr>
+        <w:t>archivos</w:t>
+      </w:r>
+      <w:proofErr w:type="spellEnd"/>
+      <w:r>
+        <w:rPr>
+          <w:b/>
+          <w:bCs/>
+          <w:lang w:val="en-US"/>
+        </w:rPr>
+        <w:t xml:space="preserve"> al staging</w:t>
       </w:r>
       <w:r>
         <w:rPr>
@@ -323,7 +377,35 @@
         <w:rPr>
           <w:lang w:val="es-419"/>
         </w:rPr>
-        <w:t>: git commit -m "mensaje"</w:t>
+        <w:t xml:space="preserve">: </w:t>
+      </w:r>
+      <w:proofErr w:type="spellStart"/>
+      <w:r>
+        <w:rPr>
+          <w:lang w:val="es-419"/>
+        </w:rPr>
+        <w:t>git</w:t>
+      </w:r>
+      <w:proofErr w:type="spellEnd"/>
+      <w:r>
+        <w:rPr>
+          <w:lang w:val="es-419"/>
+        </w:rPr>
+        <w:t xml:space="preserve"> </w:t>
+      </w:r>
+      <w:proofErr w:type="spellStart"/>
+      <w:r>
+        <w:rPr>
+          <w:lang w:val="es-419"/>
+        </w:rPr>
+        <w:t>commit</w:t>
+      </w:r>
+      <w:proofErr w:type="spellEnd"/>
+      <w:r>
+        <w:rPr>
+          <w:lang w:val="es-419"/>
+        </w:rPr>
+        <w:t xml:space="preserve"> -m "mensaje"</w:t>
       </w:r>
     </w:p>
     <w:p>
@@ -348,7 +430,49 @@
         <w:rPr>
           <w:lang w:val="es-419"/>
         </w:rPr>
-        <w:t>: git remote add origin URL</w:t>
+        <w:t xml:space="preserve">: </w:t>
+      </w:r>
+      <w:proofErr w:type="spellStart"/>
+      <w:r>
+        <w:rPr>
+          <w:lang w:val="es-419"/>
+        </w:rPr>
+        <w:t>git</w:t>
+      </w:r>
+      <w:proofErr w:type="spellEnd"/>
+      <w:r>
+        <w:rPr>
+          <w:lang w:val="es-419"/>
+        </w:rPr>
+        <w:t xml:space="preserve"> remote </w:t>
+      </w:r>
+      <w:proofErr w:type="spellStart"/>
+      <w:r>
+        <w:rPr>
+          <w:lang w:val="es-419"/>
+        </w:rPr>
+        <w:t>add</w:t>
+      </w:r>
+      <w:proofErr w:type="spellEnd"/>
+      <w:r>
+        <w:rPr>
+          <w:lang w:val="es-419"/>
+        </w:rPr>
+        <w:t xml:space="preserve"> </w:t>
+      </w:r>
+      <w:proofErr w:type="spellStart"/>
+      <w:r>
+        <w:rPr>
+          <w:lang w:val="es-419"/>
+        </w:rPr>
+        <w:t>origin</w:t>
+      </w:r>
+      <w:proofErr w:type="spellEnd"/>
+      <w:r>
+        <w:rPr>
+          <w:lang w:val="es-419"/>
+        </w:rPr>
+        <w:t xml:space="preserve"> URL</w:t>
       </w:r>
     </w:p>
     <w:p>
@@ -373,8 +497,58 @@
         <w:rPr>
           <w:lang w:val="es-419"/>
         </w:rPr>
-        <w:t>: git push origin main</w:t>
-      </w:r>
+        <w:t xml:space="preserve">: </w:t>
+      </w:r>
+      <w:proofErr w:type="spellStart"/>
+      <w:r>
+        <w:rPr>
+          <w:lang w:val="es-419"/>
+        </w:rPr>
+        <w:t>git</w:t>
+      </w:r>
+      <w:proofErr w:type="spellEnd"/>
+      <w:r>
+        <w:rPr>
+          <w:lang w:val="es-419"/>
+        </w:rPr>
+        <w:t xml:space="preserve"> </w:t>
+      </w:r>
+      <w:proofErr w:type="spellStart"/>
+      <w:r>
+        <w:rPr>
+          <w:lang w:val="es-419"/>
+        </w:rPr>
+        <w:t>push</w:t>
+      </w:r>
+      <w:proofErr w:type="spellEnd"/>
+      <w:r>
+        <w:rPr>
+          <w:lang w:val="es-419"/>
+        </w:rPr>
+        <w:t xml:space="preserve"> </w:t>
+      </w:r>
+      <w:proofErr w:type="spellStart"/>
+      <w:r>
+        <w:rPr>
+          <w:lang w:val="es-419"/>
+        </w:rPr>
+        <w:t>origin</w:t>
+      </w:r>
+      <w:proofErr w:type="spellEnd"/>
+      <w:r>
+        <w:rPr>
+          <w:lang w:val="es-419"/>
+        </w:rPr>
+        <w:t xml:space="preserve"> </w:t>
+      </w:r>
+      <w:proofErr w:type="spellStart"/>
+      <w:r>
+        <w:rPr>
+          <w:lang w:val="es-419"/>
+        </w:rPr>
+        <w:t>main</w:t>
+      </w:r>
+      <w:proofErr w:type="spellEnd"/>
     </w:p>
     <w:p>
       <w:pPr>
@@ -398,8 +572,58 @@
         <w:rPr>
           <w:lang w:val="es-419"/>
         </w:rPr>
-        <w:t>: git pull origin main</w:t>
-      </w:r>
+        <w:t xml:space="preserve">: </w:t>
+      </w:r>
+      <w:proofErr w:type="spellStart"/>
+      <w:r>
+        <w:rPr>
+          <w:lang w:val="es-419"/>
+        </w:rPr>
+        <w:t>git</w:t>
+      </w:r>
+      <w:proofErr w:type="spellEnd"/>
+      <w:r>
+        <w:rPr>
+          <w:lang w:val="es-419"/>
+        </w:rPr>
+        <w:t xml:space="preserve"> </w:t>
+      </w:r>
+      <w:proofErr w:type="spellStart"/>
+      <w:r>
+        <w:rPr>
+          <w:lang w:val="es-419"/>
+        </w:rPr>
+        <w:t>pull</w:t>
+      </w:r>
+      <w:proofErr w:type="spellEnd"/>
+      <w:r>
+        <w:rPr>
+          <w:lang w:val="es-419"/>
+        </w:rPr>
+        <w:t xml:space="preserve"> </w:t>
+      </w:r>
+      <w:proofErr w:type="spellStart"/>
+      <w:r>
+        <w:rPr>
+          <w:lang w:val="es-419"/>
+        </w:rPr>
+        <w:t>origin</w:t>
+      </w:r>
+      <w:proofErr w:type="spellEnd"/>
+      <w:r>
+        <w:rPr>
+          <w:lang w:val="es-419"/>
+        </w:rPr>
+        <w:t xml:space="preserve"> </w:t>
+      </w:r>
+      <w:proofErr w:type="spellStart"/>
+      <w:r>
+        <w:rPr>
+          <w:lang w:val="es-419"/>
+        </w:rPr>
+        <w:t>main</w:t>
+      </w:r>
+      <w:proofErr w:type="spellEnd"/>
     </w:p>
     <w:p>
       <w:pPr>
@@ -564,7 +788,35 @@
         <w:rPr>
           <w:lang w:val="es-419"/>
         </w:rPr>
-        <w:t>: se conecta con plataformas como GitHub, GitLab o Bitbucket.</w:t>
+        <w:t xml:space="preserve">: se conecta con plataformas como GitHub, </w:t>
+      </w:r>
+      <w:proofErr w:type="spellStart"/>
+      <w:r>
+        <w:rPr>
+          <w:lang w:val="es-419"/>
+        </w:rPr>
+        <w:t>GitLab</w:t>
+      </w:r>
+      <w:proofErr w:type="spellEnd"/>
+      <w:r>
+        <w:rPr>
+          <w:lang w:val="es-419"/>
+        </w:rPr>
+        <w:t xml:space="preserve"> o </w:t>
+      </w:r>
+      <w:proofErr w:type="spellStart"/>
+      <w:r>
+        <w:rPr>
+          <w:lang w:val="es-419"/>
+        </w:rPr>
+        <w:t>Bitbucket</w:t>
+      </w:r>
+      <w:proofErr w:type="spellEnd"/>
+      <w:r>
+        <w:rPr>
+          <w:lang w:val="es-419"/>
+        </w:rPr>
+        <w:t>.</w:t>
       </w:r>
     </w:p>
     <w:p>
@@ -586,11 +838,19 @@
           <w:lang w:val="es-419"/>
         </w:rPr>
       </w:pPr>
-      <w:r>
-        <w:rPr>
-          <w:lang w:val="es-419"/>
-        </w:rPr>
-        <w:t xml:space="preserve">Commit del alumno 1: </w:t>
+      <w:proofErr w:type="spellStart"/>
+      <w:r>
+        <w:rPr>
+          <w:lang w:val="es-419"/>
+        </w:rPr>
+        <w:t>Commit</w:t>
+      </w:r>
+      <w:proofErr w:type="spellEnd"/>
+      <w:r>
+        <w:rPr>
+          <w:lang w:val="es-419"/>
+        </w:rPr>
+        <w:t xml:space="preserve"> del alumno 1: </w:t>
       </w:r>
       <w:hyperlink r:id="rId6" w:history="1">
         <w:r>
@@ -605,7 +865,57 @@
     <w:p>
       <w:pPr>
         <w:rPr>
+          <w:lang w:val="es-419"/>
+        </w:rPr>
+      </w:pPr>
+    </w:p>
+    <w:p>
+      <w:pPr>
+        <w:rPr>
+          <w:lang w:val="es-419"/>
+        </w:rPr>
+      </w:pPr>
+      <w:proofErr w:type="spellStart"/>
+      <w:r>
+        <w:rPr>
+          <w:lang w:val="es-419"/>
+        </w:rPr>
+        <w:t>Commit</w:t>
+      </w:r>
+      <w:proofErr w:type="spellEnd"/>
+      <w:r>
+        <w:rPr>
+          <w:lang w:val="es-419"/>
+        </w:rPr>
+        <w:t xml:space="preserve"> del alumno 2: </w:t>
+      </w:r>
+      <w:hyperlink r:id="rId7" w:history="1">
+        <w:r>
+          <w:rPr>
+            <w:rStyle w:val="Hipervnculo"/>
+            <w:lang w:val="es-419"/>
+          </w:rPr>
+          <w:t>https://github.com/megl-fp/Distri_Tarea1/commit/87dd4489f2f6c61fa0b4acf4c880ed48d124379</w:t>
+        </w:r>
+      </w:hyperlink>
+      <w:r>
+        <w:rPr>
+          <w:lang w:val="es-419"/>
+        </w:rPr>
+        <w:t>d</w:t>
+      </w:r>
+    </w:p>
+    <w:p>
+      <w:pPr>
+        <w:rPr>
           <w:u w:val="single"/>
+          <w:lang w:val="es-419"/>
+        </w:rPr>
+      </w:pPr>
+    </w:p>
+    <w:p>
+      <w:pPr>
+        <w:rPr>
           <w:lang w:val="en-US"/>
         </w:rPr>
       </w:pPr>
@@ -613,27 +923,38 @@
         <w:rPr>
           <w:lang w:val="en-US"/>
         </w:rPr>
-        <w:t>Commit d</w:t>
-      </w:r>
+        <w:t xml:space="preserve">Commit del </w:t>
+      </w:r>
+      <w:proofErr w:type="spellStart"/>
       <w:r>
         <w:rPr>
           <w:lang w:val="en-US"/>
         </w:rPr>
-        <w:t xml:space="preserve">el alumno 2: </w:t>
-      </w:r>
-    </w:p>
-    <w:p>
-      <w:pPr>
+        <w:t>tp</w:t>
+      </w:r>
+      <w:proofErr w:type="spellEnd"/>
+      <w:r>
         <w:rPr>
           <w:lang w:val="en-US"/>
         </w:rPr>
-      </w:pPr>
-      <w:r>
+        <w:t xml:space="preserve">: </w:t>
+      </w:r>
+      <w:hyperlink r:id="rId8" w:history="1">
+        <w:r>
+          <w:rPr>
+            <w:rStyle w:val="Hipervnculo"/>
+            <w:lang w:val="en-US"/>
+          </w:rPr>
+          <w:t>https://github.com/megl-fp/Distri_Tarea1/commit/2aa55a5efd4c2094eb07eff5f979a0749b441b25</w:t>
+        </w:r>
+      </w:hyperlink>
+    </w:p>
+    <w:p>
+      <w:pPr>
         <w:rPr>
           <w:lang w:val="en-US"/>
         </w:rPr>
-        <w:t xml:space="preserve">Commit del tp: </w:t>
-      </w:r>
+      </w:pPr>
     </w:p>
     <w:sectPr>
       <w:pgSz w:w="11906" w:h="16838"/>

</xml_diff>